<commit_message>
updated ai usage doc
</commit_message>
<xml_diff>
--- a/aiusage.docx
+++ b/aiusage.docx
@@ -44,19 +44,26 @@
     <w:p>
       <w:pPr>
         <w:spacing w:after="240" w:before="240" w:lineRule="auto"/>
-        <w:rPr>
-          <w:b w:val="1"/>
-          <w:bCs w:val="1"/>
-          <w:i w:val="1"/>
-          <w:iCs w:val="1"/>
-        </w:rPr>
+        <w:rPr/>
       </w:pPr>
       <w:r>
         <w:rPr>
           <w:rtl w:val="0"/>
         </w:rPr>
         <w:br w:type="textWrapping"/>
-        <w:t xml:space="preserve">This conversation used the SSU-provided ChatGPT subscription.</w:t>
+        <w:t xml:space="preserve">This conversation used the SSU-provided ChatGPT subscription. </w:t>
+      </w:r>
+    </w:p>
+    <w:p>
+      <w:pPr>
+        <w:spacing w:after="240" w:before="240" w:lineRule="auto"/>
+        <w:rPr/>
+      </w:pPr>
+      <w:r>
+        <w:rPr>
+          <w:rtl w:val="0"/>
+        </w:rPr>
+        <w:t xml:space="preserve"> </w:t>
         <w:br w:type="textWrapping"/>
         <w:t xml:space="preserve">Direct Link to chat log:</w:t>
         <w:br w:type="textWrapping"/>
@@ -75,16 +82,65 @@
         <w:rPr>
           <w:rtl w:val="0"/>
         </w:rPr>
+      </w:r>
+    </w:p>
+    <w:p>
+      <w:pPr>
+        <w:spacing w:after="240" w:before="240" w:lineRule="auto"/>
+        <w:rPr/>
+      </w:pPr>
+      <w:r>
+        <w:rPr>
+          <w:rtl w:val="0"/>
+        </w:rPr>
+        <w:t xml:space="preserve">Due to organizational policy, the reader must also be logged into a </w:t>
+      </w:r>
+      <w:hyperlink r:id="rId7">
+        <w:r>
+          <w:rPr>
+            <w:color w:val="1155cc"/>
+            <w:u w:val="single"/>
+            <w:rtl w:val="0"/>
+          </w:rPr>
+          <w:t xml:space="preserve">sonoma.edu</w:t>
+        </w:r>
+      </w:hyperlink>
+      <w:r>
+        <w:rPr>
+          <w:rtl w:val="0"/>
+        </w:rPr>
+        <w:t xml:space="preserve"> authorized chatgpt session to view this link.</w:t>
+      </w:r>
+    </w:p>
+    <w:p>
+      <w:pPr>
+        <w:spacing w:after="240" w:before="240" w:lineRule="auto"/>
+        <w:rPr/>
+      </w:pPr>
+      <w:r>
+        <w:rPr>
+          <w:rtl w:val="0"/>
+        </w:rPr>
         <w:br w:type="textWrapping"/>
+        <w:t xml:space="preserve">In case that link is broken for any reason or cannot be accessed, a complete transcript is copied into this document.</w:t>
+      </w:r>
+    </w:p>
+    <w:p>
+      <w:pPr>
+        <w:spacing w:after="240" w:before="240" w:lineRule="auto"/>
+        <w:rPr>
+          <w:b w:val="1"/>
+          <w:bCs w:val="1"/>
+          <w:i w:val="1"/>
+          <w:iCs w:val="1"/>
+        </w:rPr>
+      </w:pPr>
+      <w:r>
+        <w:rPr>
+          <w:rtl w:val="0"/>
+        </w:rPr>
         <w:br w:type="textWrapping"/>
-        <w:t xml:space="preserve">In case that link is broken for any reason, a complete transcript is copied into this document.</w:t>
-      </w:r>
-      <w:r>
-        <w:rPr>
-          <w:rtl w:val="0"/>
-        </w:rPr>
-        <w:br w:type="textWrapping"/>
-        <w:t xml:space="preserve">Each new prompt after the first is set to the top of a page in this document, to help readability.</w:t>
+        <w:t xml:space="preserve">Each new prompt after the first, is set to the top of a page in this document, to help readability.</w:t>
         <w:br w:type="textWrapping"/>
         <w:br w:type="textWrapping"/>
       </w:r>

</xml_diff>